<commit_message>
Jesus When You Died lyrics: add Verse 3 and closing chorus
Co-Authored-By: Claude Opus 5 <noreply@anthropic.com>
</commit_message>
<xml_diff>
--- a/songs/Jesus When You Died TCC Lyrics.docx
+++ b/songs/Jesus When You Died TCC Lyrics.docx
@@ -169,6 +169,102 @@
         <w:t xml:space="preserve">You showed us Your love</w:t>
         <w:br w:type="textWrapping"/>
         <w:t xml:space="preserve">You did it to serve us</w:t>
+      </w:r>
+    </w:p>
+    <w:p>
+      <w:pPr>
+        <w:rPr>
+          <w:rFonts w:ascii="Verdana" w:cs="Verdana" w:eastAsia="Verdana" w:hAnsi="Verdana"/>
+          <w:color w:val="363636"/>
+          <w:highlight w:val="white"/>
+        </w:rPr>
+      </w:pPr>
+      <w:r>
+        <w:rPr>
+          <w:rtl w:val="0"/>
+        </w:rPr>
+      </w:r>
+    </w:p>
+    <w:p>
+      <w:pPr>
+        <w:rPr>
+          <w:rFonts w:ascii="Verdana" w:cs="Verdana" w:eastAsia="Verdana" w:hAnsi="Verdana"/>
+          <w:color w:val="363636"/>
+          <w:highlight w:val="white"/>
+        </w:rPr>
+      </w:pPr>
+      <w:r>
+        <w:rPr>
+          <w:rFonts w:ascii="Verdana" w:cs="Verdana" w:eastAsia="Verdana" w:hAnsi="Verdana"/>
+          <w:color w:val="363636"/>
+          <w:highlight w:val="white"/>
+          <w:rtl w:val="0"/>
+        </w:rPr>
+        <w:t xml:space="preserve">[Chorus]</w:t>
+        <w:br w:type="textWrapping"/>
+        <w:t xml:space="preserve">Thank you</w:t>
+        <w:br w:type="textWrapping"/>
+        <w:t xml:space="preserve">Jesus thank you</w:t>
+        <w:br w:type="textWrapping"/>
+        <w:t xml:space="preserve">That You died for us</w:t>
+        <w:br w:type="textWrapping"/>
+        <w:t xml:space="preserve">We will always</w:t>
+        <w:br w:type="textWrapping"/>
+        <w:t xml:space="preserve">Thank you</w:t>
+        <w:br w:type="textWrapping"/>
+        <w:t xml:space="preserve">Jesus thank you</w:t>
+        <w:br w:type="textWrapping"/>
+        <w:t xml:space="preserve">That You died for us</w:t>
+        <w:br w:type="textWrapping"/>
+        <w:t xml:space="preserve">On the cross</w:t>
+      </w:r>
+    </w:p>
+    <w:p>
+      <w:pPr>
+        <w:rPr>
+          <w:rFonts w:ascii="Verdana" w:cs="Verdana" w:eastAsia="Verdana" w:hAnsi="Verdana"/>
+          <w:color w:val="363636"/>
+          <w:highlight w:val="white"/>
+        </w:rPr>
+      </w:pPr>
+      <w:r>
+        <w:rPr>
+          <w:rtl w:val="0"/>
+        </w:rPr>
+      </w:r>
+    </w:p>
+    <w:p>
+      <w:pPr>
+        <w:rPr>
+          <w:rFonts w:ascii="Verdana" w:cs="Verdana" w:eastAsia="Verdana" w:hAnsi="Verdana"/>
+          <w:color w:val="363636"/>
+          <w:highlight w:val="white"/>
+        </w:rPr>
+      </w:pPr>
+      <w:r>
+        <w:rPr>
+          <w:rFonts w:ascii="Verdana" w:cs="Verdana" w:eastAsia="Verdana" w:hAnsi="Verdana"/>
+          <w:color w:val="363636"/>
+          <w:highlight w:val="white"/>
+          <w:rtl w:val="0"/>
+        </w:rPr>
+        <w:t xml:space="preserve">[Verse 3]</w:t>
+        <w:br w:type="textWrapping"/>
+        <w:t xml:space="preserve">Jesus when You died</w:t>
+        <w:br w:type="textWrapping"/>
+        <w:t xml:space="preserve">All our sin was paid for</w:t>
+        <w:br w:type="textWrapping"/>
+        <w:t xml:space="preserve">Now we're free to live</w:t>
+        <w:br w:type="textWrapping"/>
+        <w:t xml:space="preserve">The life that we were made for</w:t>
+        <w:br w:type="textWrapping"/>
+        <w:t xml:space="preserve">One with God above</w:t>
+        <w:br w:type="textWrapping"/>
+        <w:t xml:space="preserve">Living as His children</w:t>
+        <w:br w:type="textWrapping"/>
+        <w:t xml:space="preserve">We trust in His words</w:t>
+        <w:br w:type="textWrapping"/>
+        <w:t xml:space="preserve">Knowing You fulfilled them</w:t>
       </w:r>
     </w:p>
     <w:p>

</xml_diff>